<commit_message>
Fix recommendation language across docs and README to match final POC recommendation; remove Cell-by-Cell Reference
Approach Document, Results Summary, and Business Note now consistently
frame this as a proof-of-concept comparison between the MLP and CNN
rather than a deploy-the-MLP recommendation. README's Quick Start and
"What's in this repo" sections are updated to match (Parts A-H, no
business-cost-analysis mention on the notebook line). Cell-by-Cell
Reference is dropped as a deliverable.
</commit_message>
<xml_diff>
--- a/docs/Approach_Document.docx
+++ b/docs/Approach_Document.docx
@@ -323,23 +323,23 @@
         <w:spacing w:after="160"/>
       </w:pPr>
       <w:r>
-        <w:t xml:space="preserve">The plan, agreed on August 10th: attempt the CNN first (Part J of the notebook), since it is the real, graded model trained on real handwritten EMNIST data. If it underperformed on the actual task or time ran out, fall back to the MLP architecture that was already working and validated end-to-end in Part E/F.</w:t>
-      </w:r>
-    </w:p>
-    <w:p>
-      <w:pPr>
-        <w:spacing w:after="160"/>
-      </w:pPr>
-      <w:r>
-        <w:t xml:space="preserve">Both were built. The CNN (two convolutional layers, max pooling, two fully-connected layers, trained with class-weighted cross-entropy loss) reached 92.0% character-level accuracy on real, held-out EMNIST test images -- a legitimate, reproducible result on its native domain. The MLP (two hidden layers, 256 and 128 units) reached 100% character-level accuracy on synthetic, held-out test characters -- expected, since it was trained on data matching its own test distribution exactly, and treated throughout as a closed-loop pipeline sanity check rather than a real-world claim.</w:t>
-      </w:r>
-    </w:p>
-    <w:p>
-      <w:pPr>
-        <w:spacing w:after="160"/>
-      </w:pPr>
-      <w:r>
-        <w:t xml:space="preserve">The fallback triggered as planned. When the CNN was tested against the same synthetic, printed-style plates used to validate the rest of the pipeline, its plate-level accuracy fell to 43-62% depending on noise condition, even though its character-level accuracy on that same data stayed in the high 80s to low 90s. The MLP, tested identically, stayed at 100% across every condition. The gap is not a quality difference between the two models in general -- the CNN is demonstrably the stronger real-handwriting recognizer. It is a fit difference: the MLP was trained on data that matches the actual application (printed plate characters), and the CNN was not. Per the team's own fallback decision, the MLP is the classifier recommended for the deployed system on this specific task, with the CNN's results reported honestly as the evidence behind that call.</w:t>
+        <w:t>The MLP (Part E/F) was built first, to get a full working pipeline end to end without waiting on GPU access or a live EMNIST download. Once that pipeline was tested, the CNN (Part J) was built and trained on real handwritten EMNIST data, to test the assignment's own spike question: does a model trained on handwriting generalize to printed plate text?</w:t>
+      </w:r>
+    </w:p>
+    <w:p>
+      <w:pPr>
+        <w:spacing w:after="160"/>
+      </w:pPr>
+      <w:r>
+        <w:t>Both were built. The CNN (two convolutional layers, max pooling, two fully-connected layers, trained with class-weighted cross-entropy loss) reached roughly 92% character-level accuracy on real, held-out EMNIST test images — a legitimate, reproducible result on its native domain. The MLP (two hidden layers, 256 and 128 units) reached 100% character-level accuracy on synthetic, held-out test characters — expected, since it was trained on data matching its own test distribution exactly, and treated throughout as a closed-loop pipeline sanity check rather than a real-world claim.</w:t>
+      </w:r>
+    </w:p>
+    <w:p>
+      <w:pPr>
+        <w:spacing w:after="160"/>
+      </w:pPr>
+      <w:r>
+        <w:t>The two models were not built to compete for a single deployment slot — they were built to compare how a model trained on real handwritten data and a model trained on matching synthetic printed data each perform on the same printed-plate task. When the CNN was tested against the same synthetic, printed-style plates used to validate the rest of the pipeline, its plate-level accuracy fell to roughly 37-62% depending on noise condition, even though its character-level accuracy on that same data stayed in the high 80s to low 90s. The MLP, tested identically, stayed at 100% across every condition. The gap is not a quality difference between the two models in general — the CNN is demonstrably the stronger real-handwriting recognizer. It is a fit difference: the MLP was trained on data that matches the actual application (printed plate characters), and the CNN was not. This is a proof-of-concept finding, not a deployment decision: neither model has been validated against real plate photos at scale, and this project's conclusion is that more time and testing are needed before either model is ready for production.</w:t>
       </w:r>
     </w:p>
     <w:p>
@@ -469,6 +469,75 @@
       <w:pPr>
         <w:spacing w:after="200"/>
       </w:pPr>
+    </w:p>
+    <w:p>
+      <w:pPr>
+        <w:pStyle w:val="Heading1"/>
+        <w:spacing w:after="120" w:before="240"/>
+      </w:pPr>
+      <w:r>
+        <w:t xml:space="preserve">9. Next steps</w:t>
+      </w:r>
+    </w:p>
+    <w:p>
+      <w:pPr>
+        <w:spacing w:after="160"/>
+      </w:pPr>
+      <w:r>
+        <w:t xml:space="preserve">This project is a proof of concept, not a deployment-ready system. With more time, the priorities would be:</w:t>
+      </w:r>
+    </w:p>
+    <w:p>
+      <w:pPr>
+        <w:pStyle w:val="ListParagraph"/>
+        <w:numPr>
+          <w:ilvl w:val="0"/>
+          <w:numId w:val="1"/>
+        </w:numPr>
+        <w:spacing w:after="80"/>
+      </w:pPr>
+      <w:r>
+        <w:t xml:space="preserve">Retrain or fine-tune the CNN on printed-style character data, so its training matches the actual task instead of only real handwriting.</w:t>
+      </w:r>
+    </w:p>
+    <w:p>
+      <w:pPr>
+        <w:pStyle w:val="ListParagraph"/>
+        <w:numPr>
+          <w:ilvl w:val="0"/>
+          <w:numId w:val="1"/>
+        </w:numPr>
+        <w:spacing w:after="80"/>
+      </w:pPr>
+      <w:r>
+        <w:t xml:space="preserve">Fix the CNN's confidence calibration so its uncertainty actually reflects correctness — under clean and moderate conditions it stayed highly confident even when wrong, which defeats the routing policy's safety net.</w:t>
+      </w:r>
+    </w:p>
+    <w:p>
+      <w:pPr>
+        <w:pStyle w:val="ListParagraph"/>
+        <w:numPr>
+          <w:ilvl w:val="0"/>
+          <w:numId w:val="1"/>
+        </w:numPr>
+        <w:spacing w:after="80"/>
+      </w:pPr>
+      <w:r>
+        <w:t xml:space="preserve">Validate both models against real plate photos at scale, instead of only synthetic plates and each model's own native test set.</w:t>
+      </w:r>
+    </w:p>
+    <w:p>
+      <w:pPr>
+        <w:pStyle w:val="ListParagraph"/>
+        <w:numPr>
+          <w:ilvl w:val="0"/>
+          <w:numId w:val="1"/>
+        </w:numPr>
+        <w:spacing w:after="80"/>
+      </w:pPr>
+      <w:r>
+        <w:t xml:space="preserve">Address the mild overfitting observed during CNN training (Part J): training accuracy kept climbing through epoch 15 while validation accuracy plateaued after epoch 9. Early stopping, more real training data, and data augmentation would all help.</w:t>
+      </w:r>
     </w:p>
     <w:p>
       <w:pPr>

</xml_diff>